<commit_message>
Reports: name the tool pheXWAS (formerly pheauxWAS), version 1.2.0, phrasing fixes
Co-Authored-By: Claude Opus 5.5 <noreply@anthropic.com>
</commit_message>
<xml_diff>
--- a/docs/reports/run3_2026-10-09/HaT pheWAS preliminary (concise) report 10-9.docx
+++ b/docs/reports/run3_2026-10-09/HaT pheWAS preliminary (concise) report 10-9.docx
@@ -385,7 +385,7 @@
         <w:t xml:space="preserve"> </w:t>
       </w:r>
       <w:r>
-        <w:t xml:space="preserve">The published pyPheWAS package, run on identical inputs and compared under its own rules, agrees with our tool (pheauxWAS) phecode for phecode: correlation 0.999 where neither fit is separated, every estimate in the same direction.</w:t>
+        <w:t xml:space="preserve">The published pyPheWAS package, run on identical inputs and compared under its own rules, agrees with our tool (pheXWAS) phecode for phecode: correlation 0.999 where neither fit is separated, every estimate in the same direction.</w:t>
       </w:r>
     </w:p>
     <w:bookmarkEnd w:id="9"/>
@@ -2708,7 +2708,7 @@
         <w:t xml:space="preserve"> </w:t>
       </w:r>
       <w:r>
-        <w:t xml:space="preserve">underflow (q &lt; 1e-300) and carry no ranking information; effect sizes should guide reading.</w:t>
+        <w:t xml:space="preserve">underflow (p &lt;1e-300) and carry no ranking information; effect sizes should guide reading.</w:t>
       </w:r>
     </w:p>
     <w:p>
@@ -2830,7 +2830,7 @@
         <w:t xml:space="preserve"> </w:t>
       </w:r>
       <w:r>
-        <w:t xml:space="preserve">pheauxWAS is purpose-written, verified against pyPheWAS and by self-tests. One fix during the work: sex-specific phecodes were first analysed in both sexes; the rerun with the fix changed little and all results here are from it.</w:t>
+        <w:t xml:space="preserve">pheXWAS is purpose-written, verified against pyPheWAS and by self-tests. One fix during the work: sex-specific phecodes were first analysed in both sexes; the rerun with the fix changed little and all results here are from it.</w:t>
       </w:r>
     </w:p>
     <w:p>

</xml_diff>